<commit_message>
Add deployment links to deliverables
</commit_message>
<xml_diff>
--- a/ethan_moon_task_manager_assessment.docx
+++ b/ethan_moon_task_manager_assessment.docx
@@ -82,7 +82,7 @@
           <w:b w:val="0"/>
           <w:sz w:val="22"/>
         </w:rPr>
-        <w:t>Live frontend app: TODO - paste the deployed Vercel, Netlify, or Cloudflare Pages URL.</w:t>
+        <w:t>Live frontend app: https://np-kanban-assessment.vercel.app</w:t>
       </w:r>
     </w:p>
     <w:p>
@@ -96,7 +96,7 @@
           <w:b w:val="0"/>
           <w:sz w:val="22"/>
         </w:rPr>
-        <w:t>GitHub repository: TODO - paste the public or shared private repository URL.</w:t>
+        <w:t>GitHub repository: https://github.com/emoon0108/np-kanban-assessment</w:t>
       </w:r>
     </w:p>
     <w:p>

</xml_diff>